<commit_message>
Task 2 removed other tasks material
</commit_message>
<xml_diff>
--- a/Lab2Report.docx
+++ b/Lab2Report.docx
@@ -97,6 +97,9 @@
         <w:t xml:space="preserve"> </w:t>
       </w:r>
       <w:r>
+        <w:rPr>
+          <w:noProof/>
+        </w:rPr>
         <w:drawing>
           <wp:inline distT="0" distB="0" distL="0" distR="0" wp14:anchorId="0C15EA9F" wp14:editId="3FD67E86">
             <wp:extent cx="76211" cy="85737"/>
@@ -134,10 +137,7 @@
         </w:drawing>
       </w:r>
       <w:r>
-        <w:t xml:space="preserve"> button in visual </w:t>
-      </w:r>
-      <w:r>
-        <w:t>(Total Amount of Sales).</w:t>
+        <w:t xml:space="preserve"> button in visual (Total Amount of Sales).</w:t>
       </w:r>
     </w:p>
     <w:p>
@@ -145,16 +145,7 @@
         <w:pStyle w:val="ListParagraph"/>
       </w:pPr>
       <w:r>
-        <w:t>Also, edit</w:t>
-      </w:r>
-      <w:r>
-        <w:t xml:space="preserve"> interactions-&gt;Select slicer (</w:t>
-      </w:r>
-      <w:r>
-        <w:t>OrderDateYear</w:t>
-      </w:r>
-      <w:r>
-        <w:t xml:space="preserve"> filter)-&gt;press none</w:t>
+        <w:t>Also, edit interactions-&gt;Select slicer (OrderDateYear filter)-&gt;press none</w:t>
       </w:r>
       <w:r>
         <w:rPr>
@@ -163,6 +154,9 @@
         <w:t xml:space="preserve"> </w:t>
       </w:r>
       <w:r>
+        <w:rPr>
+          <w:noProof/>
+        </w:rPr>
         <w:drawing>
           <wp:inline distT="0" distB="0" distL="0" distR="0" wp14:anchorId="74374F80" wp14:editId="08F1DC29">
             <wp:extent cx="76211" cy="85737"/>
@@ -200,13 +194,7 @@
         </w:drawing>
       </w:r>
       <w:r>
-        <w:t xml:space="preserve"> button in visual</w:t>
-      </w:r>
-      <w:r>
-        <w:t xml:space="preserve"> </w:t>
-      </w:r>
-      <w:r>
-        <w:t>(Total Amount of Sales).</w:t>
+        <w:t xml:space="preserve"> button in visual (Total Amount of Sales).</w:t>
       </w:r>
     </w:p>
     <w:p>
@@ -649,6 +637,9 @@
         <w:t xml:space="preserve"> </w:t>
       </w:r>
       <w:r>
+        <w:rPr>
+          <w:noProof/>
+        </w:rPr>
         <w:drawing>
           <wp:inline distT="0" distB="0" distL="0" distR="0" wp14:anchorId="2756AEF3" wp14:editId="53CBF695">
             <wp:extent cx="4746658" cy="2990850"/>
@@ -707,15 +698,12 @@
         <w:ind w:left="360"/>
       </w:pPr>
       <w:r>
-        <w:rPr>
-          <w:noProof/>
-        </w:rPr>
         <w:lastRenderedPageBreak/>
         <w:drawing>
-          <wp:inline distT="0" distB="0" distL="0" distR="0" wp14:anchorId="7978DC2F" wp14:editId="7543E8CC">
-            <wp:extent cx="6152515" cy="3397885"/>
+          <wp:inline distT="0" distB="0" distL="0" distR="0" wp14:anchorId="2A004C26" wp14:editId="2186D0DB">
+            <wp:extent cx="6152515" cy="3340735"/>
             <wp:effectExtent l="0" t="0" r="635" b="0"/>
-            <wp:docPr id="1660840523" name="Picture 1"/>
+            <wp:docPr id="613018852" name="Picture 1"/>
             <wp:cNvGraphicFramePr>
               <a:graphicFrameLocks xmlns:a="http://schemas.openxmlformats.org/drawingml/2006/main" noChangeAspect="1"/>
             </wp:cNvGraphicFramePr>
@@ -723,7 +711,7 @@
               <a:graphicData uri="http://schemas.openxmlformats.org/drawingml/2006/picture">
                 <pic:pic xmlns:pic="http://schemas.openxmlformats.org/drawingml/2006/picture">
                   <pic:nvPicPr>
-                    <pic:cNvPr id="1660840523" name=""/>
+                    <pic:cNvPr id="613018852" name=""/>
                     <pic:cNvPicPr/>
                   </pic:nvPicPr>
                   <pic:blipFill>
@@ -735,7 +723,7 @@
                   <pic:spPr>
                     <a:xfrm>
                       <a:off x="0" y="0"/>
-                      <a:ext cx="6152515" cy="3397885"/>
+                      <a:ext cx="6152515" cy="3340735"/>
                     </a:xfrm>
                     <a:prstGeom prst="rect">
                       <a:avLst/>
@@ -1289,6 +1277,48 @@
     </w:p>
     <w:p>
       <w:pPr>
+        <w:ind w:left="360"/>
+      </w:pPr>
+      <w:r>
+        <w:drawing>
+          <wp:inline distT="0" distB="0" distL="0" distR="0" wp14:anchorId="0553D701" wp14:editId="27880DDB">
+            <wp:extent cx="6152515" cy="376555"/>
+            <wp:effectExtent l="0" t="0" r="635" b="4445"/>
+            <wp:docPr id="1998482303" name="Picture 1"/>
+            <wp:cNvGraphicFramePr>
+              <a:graphicFrameLocks xmlns:a="http://schemas.openxmlformats.org/drawingml/2006/main" noChangeAspect="1"/>
+            </wp:cNvGraphicFramePr>
+            <a:graphic xmlns:a="http://schemas.openxmlformats.org/drawingml/2006/main">
+              <a:graphicData uri="http://schemas.openxmlformats.org/drawingml/2006/picture">
+                <pic:pic xmlns:pic="http://schemas.openxmlformats.org/drawingml/2006/picture">
+                  <pic:nvPicPr>
+                    <pic:cNvPr id="1998482303" name=""/>
+                    <pic:cNvPicPr/>
+                  </pic:nvPicPr>
+                  <pic:blipFill>
+                    <a:blip r:embed="rId29"/>
+                    <a:stretch>
+                      <a:fillRect/>
+                    </a:stretch>
+                  </pic:blipFill>
+                  <pic:spPr>
+                    <a:xfrm>
+                      <a:off x="0" y="0"/>
+                      <a:ext cx="6152515" cy="376555"/>
+                    </a:xfrm>
+                    <a:prstGeom prst="rect">
+                      <a:avLst/>
+                    </a:prstGeom>
+                  </pic:spPr>
+                </pic:pic>
+              </a:graphicData>
+            </a:graphic>
+          </wp:inline>
+        </w:drawing>
+      </w:r>
+    </w:p>
+    <w:p>
+      <w:pPr>
         <w:numPr>
           <w:ilvl w:val="0"/>
           <w:numId w:val="2"/>
@@ -1330,14 +1360,14 @@
     </w:p>
     <w:p>
       <w:pPr>
-        <w:ind w:left="720"/>
-      </w:pPr>
-      <w:hyperlink r:id="rId29" w:history="1">
+        <w:ind w:left="360"/>
+      </w:pPr>
+      <w:hyperlink r:id="rId30" w:history="1">
         <w:r>
           <w:rPr>
             <w:rStyle w:val="Hyperlink"/>
           </w:rPr>
-          <w:t>https://app.powerbi.com/groups/me/repo</w:t>
+          <w:t>https://app.powerbi.com/groups/me/reports/969df6db-e573-4f26-9be6-351270b96757/Repo</w:t>
         </w:r>
         <w:r>
           <w:rPr>
@@ -1349,16 +1379,25 @@
           <w:rPr>
             <w:rStyle w:val="Hyperlink"/>
           </w:rPr>
-          <w:t>ts/92848363-4e05-43f5-a963-90749465f7ab/2984e19e057726e8c88d?ctid=b41b72d0-4e9f-4c26-8a69-f949f367c91d&amp;pbi_source=shareVisual&amp;visual=021388d78ec7c8e0aed3&amp;height=592.00&amp;width=529.33&amp;bookmarkGuid=7c9303e3-7ebd-479c-9ca8-d157086bc13c</w:t>
+          <w:t>tSection?filt</w:t>
+        </w:r>
+        <w:r>
+          <w:rPr>
+            <w:rStyle w:val="Hyperlink"/>
+          </w:rPr>
+          <w:t>e</w:t>
+        </w:r>
+        <w:r>
+          <w:rPr>
+            <w:rStyle w:val="Hyperlink"/>
+          </w:rPr>
+          <w:t>r=DimSalesTerritory/SalesTerritoryCountry eq 'Australia'</w:t>
         </w:r>
       </w:hyperlink>
     </w:p>
     <w:p>
       <w:pPr>
         <w:ind w:left="360"/>
-        <w:rPr>
-          <w:lang w:val="ru-RU"/>
-        </w:rPr>
       </w:pPr>
       <w:r>
         <w:rPr>
@@ -1381,7 +1420,7 @@
                     <pic:cNvPicPr/>
                   </pic:nvPicPr>
                   <pic:blipFill>
-                    <a:blip r:embed="rId30"/>
+                    <a:blip r:embed="rId31"/>
                     <a:stretch>
                       <a:fillRect/>
                     </a:stretch>
@@ -1406,47 +1445,6 @@
       <w:pPr>
         <w:ind w:left="360"/>
       </w:pPr>
-      <w:r>
-        <w:rPr>
-          <w:noProof/>
-          <w:lang w:val="ru-RU"/>
-        </w:rPr>
-        <w:drawing>
-          <wp:inline distT="0" distB="0" distL="0" distR="0" wp14:anchorId="649B749B" wp14:editId="1FC59A54">
-            <wp:extent cx="6152515" cy="1051560"/>
-            <wp:effectExtent l="0" t="0" r="635" b="0"/>
-            <wp:docPr id="2041592715" name="Picture 1"/>
-            <wp:cNvGraphicFramePr>
-              <a:graphicFrameLocks xmlns:a="http://schemas.openxmlformats.org/drawingml/2006/main" noChangeAspect="1"/>
-            </wp:cNvGraphicFramePr>
-            <a:graphic xmlns:a="http://schemas.openxmlformats.org/drawingml/2006/main">
-              <a:graphicData uri="http://schemas.openxmlformats.org/drawingml/2006/picture">
-                <pic:pic xmlns:pic="http://schemas.openxmlformats.org/drawingml/2006/picture">
-                  <pic:nvPicPr>
-                    <pic:cNvPr id="2041592715" name=""/>
-                    <pic:cNvPicPr/>
-                  </pic:nvPicPr>
-                  <pic:blipFill>
-                    <a:blip r:embed="rId31"/>
-                    <a:stretch>
-                      <a:fillRect/>
-                    </a:stretch>
-                  </pic:blipFill>
-                  <pic:spPr>
-                    <a:xfrm>
-                      <a:off x="0" y="0"/>
-                      <a:ext cx="6152515" cy="1051560"/>
-                    </a:xfrm>
-                    <a:prstGeom prst="rect">
-                      <a:avLst/>
-                    </a:prstGeom>
-                  </pic:spPr>
-                </pic:pic>
-              </a:graphicData>
-            </a:graphic>
-          </wp:inline>
-        </w:drawing>
-      </w:r>
     </w:p>
     <w:p/>
     <w:sectPr>
@@ -3013,7 +3011,7 @@
     </inkml:brush>
   </inkml:definitions>
   <inkml:trace contextRef="#ctx0" brushRef="#br0">2 0 24575,'0'56'0,"-2"-22"0,2 1 0,2-1 0,1 0 0,8 39 0,-10-71 0,0 0 0,0 1 0,0-1 0,0 0 0,1 0 0,-1 0 0,0 0 0,1 0 0,0 0 0,-1 0 0,1-1 0,0 1 0,0-1 0,0 1 0,0-1 0,0 0 0,0 1 0,1-1 0,-1 0 0,0-1 0,0 1 0,1 0 0,-1-1 0,1 1 0,-1-1 0,4 1 0,10 0 0,0-1 0,-1 0 0,20-3 0,-5 1 0,13 3-26,-28 0-242,-1-1 0,0 0 1,1-1-1,21-4 0,-25 1-6558</inkml:trace>
-  <inkml:trace contextRef="#ctx0" brushRef="#br0" timeOffset="437.42">338 177 24575,'0'319'-1365,"0"-304"-5461</inkml:trace>
+  <inkml:trace contextRef="#ctx0" brushRef="#br0" timeOffset="437.41">338 177 24575,'0'319'-1365,"0"-304"-5461</inkml:trace>
 </inkml:ink>
 </file>
 
@@ -3042,7 +3040,7 @@
   </inkml:definitions>
   <inkml:trace contextRef="#ctx0" brushRef="#br0">636 251 24575,'-8'1'0,"0"0"0,0 0 0,1 0 0,-1 1 0,1 0 0,-1 1 0,1-1 0,-12 8 0,-58 38 0,8-5 0,60-40 0,1 2 0,0-1 0,0 1 0,0 0 0,1 1 0,0 0 0,0 0 0,0 0 0,1 1 0,0 0 0,0 0 0,1 1 0,0-1 0,0 1 0,0 1 0,1-1 0,1 0 0,-1 1 0,2 0 0,-1 0 0,1 0 0,0 0 0,1 0 0,0 0 0,0 17 0,2 9-1365,0-20-5461</inkml:trace>
   <inkml:trace contextRef="#ctx0" brushRef="#br0" timeOffset="602.16">1 464 24575,'5'0'0,"0"1"0,0-1 0,0 1 0,0 1 0,1-1 0,-2 1 0,1 0 0,0 0 0,0 0 0,-1 1 0,1 0 0,8 6 0,50 52 0,-4-5 0,-23-27 0,-29-22 0,0 0 0,1-1 0,-1 0 0,2 0 0,-1-1 0,16 8 0,-21-12 0,-1-1 0,0 1 0,1-1 0,-1 0 0,0 1 0,1-1 0,-1-1 0,1 1 0,-1 0 0,0 0 0,1-1 0,-1 1 0,1-1 0,-1 0 0,0 0 0,0 0 0,0 0 0,0 0 0,1 0 0,-1-1 0,-1 1 0,1-1 0,0 1 0,0-1 0,0 0 0,-1 0 0,1 0 0,-1 1 0,0-2 0,1 1 0,-1 0 0,1-4 0,8-11-195,0 2 0,0-1 0,2 1 0,0 1 0,0 0 0,19-15 0,-20 20-6631</inkml:trace>
-  <inkml:trace contextRef="#ctx0" brushRef="#br0" timeOffset="14680.36">865 76 24575,'0'-4'0,"0"1"0,1 0 0,-1 0 0,1 0 0,0 0 0,0 0 0,0 0 0,1 1 0,-1-1 0,1 0 0,-1 0 0,1 1 0,0-1 0,0 1 0,0 0 0,0-1 0,1 1 0,-1 0 0,0 0 0,1 1 0,0-1 0,5-2 0,-5 2 0,1 0 0,0 0 0,0 1 0,0-1 0,0 1 0,0 0 0,0 1 0,0-1 0,0 1 0,1-1 0,-1 1 0,0 0 0,0 1 0,0-1 0,1 1 0,-1 0 0,4 1 0,-6-1 0,0 0 0,0 1 0,0-1 0,-1 0 0,1 0 0,-1 1 0,1-1 0,-1 1 0,1 0 0,-1-1 0,0 1 0,0 0 0,0 0 0,0 0 0,0 0 0,0 0 0,0 0 0,-1 0 0,1 0 0,-1 0 0,1 0 0,-1 0 0,0 0 0,0 0 0,0 0 0,0 3 0,-1-3 0,1 1 0,0-1 0,0 0 0,0 1 0,1-1 0,-1 0 0,0 0 0,1 1 0,0-1 0,-1 0 0,1 0 0,0 0 0,0 0 0,0 0 0,1 0 0,-1 0 0,0 0 0,1 0 0,-1 0 0,1-1 0,-1 1 0,1-1 0,0 1 0,0-1 0,0 0 0,0 1 0,3 0 0,-2-1 0,0 0 0,0 0 0,0 0 0,0 1 0,-1-1 0,1 1 0,0 0 0,-1 0 0,1 0 0,-1 0 0,1 0 0,-1 0 0,0 1 0,0-1 0,0 1 0,0 0 0,2 4 0,-2 0 0,0 0 0,-1-1 0,0 1 0,0 0 0,0 0 0,-1 0 0,-1 10 0,1-6 0,-1 0 0,-1 0 0,1 0 0,-2 0 0,-6 19 0,9-28 0,-1 0 0,1 0 0,-1 0 0,0 0 0,0 0 0,0 0 0,0 0 0,0-1 0,0 1 0,0 0 0,-1-1 0,1 1 0,-1-1 0,1 1 0,-1-1 0,1 0 0,-1 0 0,0 0 0,0 0 0,1 0 0,-1 0 0,0 0 0,0 0 0,0-1 0,0 1 0,0-1 0,0 1 0,0-1 0,0 0 0,0 0 0,0 0 0,0 0 0,0 0 0,0 0 0,0-1 0,-1 1 0,2-1 0,-1 1 0,-3-2 0,-13-14-1365,12 5-5461</inkml:trace>
+  <inkml:trace contextRef="#ctx0" brushRef="#br0" timeOffset="14680.35">865 76 24575,'0'-4'0,"0"1"0,1 0 0,-1 0 0,1 0 0,0 0 0,0 0 0,0 0 0,1 1 0,-1-1 0,1 0 0,-1 0 0,1 1 0,0-1 0,0 1 0,0 0 0,0-1 0,1 1 0,-1 0 0,0 0 0,1 1 0,0-1 0,5-2 0,-5 2 0,1 0 0,0 0 0,0 1 0,0-1 0,0 1 0,0 0 0,0 1 0,0-1 0,0 1 0,1-1 0,-1 1 0,0 0 0,0 1 0,0-1 0,1 1 0,-1 0 0,4 1 0,-6-1 0,0 0 0,0 1 0,0-1 0,-1 0 0,1 0 0,-1 1 0,1-1 0,-1 1 0,1 0 0,-1-1 0,0 1 0,0 0 0,0 0 0,0 0 0,0 0 0,0 0 0,0 0 0,-1 0 0,1 0 0,-1 0 0,1 0 0,-1 0 0,0 0 0,0 0 0,0 0 0,0 3 0,-1-3 0,1 1 0,0-1 0,0 0 0,0 1 0,1-1 0,-1 0 0,0 0 0,1 1 0,0-1 0,-1 0 0,1 0 0,0 0 0,0 0 0,0 0 0,1 0 0,-1 0 0,0 0 0,1 0 0,-1 0 0,1-1 0,-1 1 0,1-1 0,0 1 0,0-1 0,0 0 0,0 1 0,3 0 0,-2-1 0,0 0 0,0 0 0,0 0 0,0 1 0,-1-1 0,1 1 0,0 0 0,-1 0 0,1 0 0,-1 0 0,1 0 0,-1 0 0,0 1 0,0-1 0,0 1 0,0 0 0,2 4 0,-2 0 0,0 0 0,-1-1 0,0 1 0,0 0 0,0 0 0,-1 0 0,-1 10 0,1-6 0,-1 0 0,-1 0 0,1 0 0,-2 0 0,-6 19 0,9-28 0,-1 0 0,1 0 0,-1 0 0,0 0 0,0 0 0,0 0 0,0 0 0,0-1 0,0 1 0,0 0 0,-1-1 0,1 1 0,-1-1 0,1 1 0,-1-1 0,1 0 0,-1 0 0,0 0 0,0 0 0,1 0 0,-1 0 0,0 0 0,0 0 0,0-1 0,0 1 0,0-1 0,0 1 0,0-1 0,0 0 0,0 0 0,0 0 0,0 0 0,0 0 0,0 0 0,0-1 0,-1 1 0,2-1 0,-1 1 0,-3-2 0,-13-14-1365,12 5-5461</inkml:trace>
   <inkml:trace contextRef="#ctx0" brushRef="#br0" timeOffset="16482.02">865 75 24575,'-1'-4'0,"1"0"0,0 1 0,0-1 0,0 1 0,1-1 0,0 1 0,-1-1 0,1 1 0,0-1 0,0 1 0,1 0 0,-1-1 0,1 1 0,2-4 0,-1 5 0,-1 0 0,1 0 0,-1 1 0,1-1 0,0 1 0,0-1 0,0 1 0,0 0 0,-1 0 0,1 0 0,1 1 0,-1-1 0,0 1 0,0-1 0,0 1 0,6 0 0,-6 0 0,-1 0 0,1 0 0,-1 0 0,1 0 0,-1 0 0,1 1 0,-1-1 0,1 1 0,-1 0 0,1-1 0,-1 1 0,1 0 0,-1 0 0,0 1 0,0-1 0,1 0 0,2 4 0,-4-4 0,0 1 0,0 0 0,0-1 0,0 1 0,0 0 0,0-1 0,-1 1 0,1 0 0,-1 0 0,1 0 0,-1-1 0,0 1 0,1 0 0,-1 0 0,0 0 0,-1 0 0,1 0 0,-1 3 0,0 2 0,-1-1 0,0 1 0,-1-1 0,0 0 0,0 1 0,0-1 0,-1 0 0,0-1 0,0 1 0,0-1 0,-9 9 0,-5 8 0,19-17 0,14-11 0,62-47 0,-76 53 0,0-1 0,0 0 0,0 1 0,0-1 0,0 1 0,0-1 0,0 1 0,1-1 0,-1 1 0,0 0 0,0 0 0,0 0 0,1-1 0,-1 1 0,0 0 0,0 1 0,1-1 0,-1 0 0,0 0 0,0 0 0,1 1 0,-1-1 0,0 1 0,0-1 0,0 1 0,0-1 0,0 1 0,0 0 0,2 1 0,-1 0 0,0 1 0,0 0 0,0 0 0,0 0 0,-1 0 0,1 0 0,-1 0 0,0 0 0,0 0 0,1 7 0,1 8 0,-1 0 0,0 0 0,-2 18 0,0-30 0,-1 0 0,0-1 0,0 1 0,0-1 0,-1 1 0,0-1 0,0 1 0,0-1 0,-1 0 0,1 0 0,-1 0 0,0-1 0,-1 1 0,1-1 0,-1 1 0,0-1 0,0 0 0,0-1 0,-1 1 0,1-1 0,-1 0 0,0 0 0,0 0 0,0 0 0,0-1 0,0 0 0,-1 0 0,1-1 0,-1 1 0,1-1 0,-1 0 0,0-1 0,1 1 0,-1-1 0,0 0 0,1-1 0,-11-1 0,14 1-76,0 1 1,0 0-1,0-1 0,0 0 0,0 1 0,1-1 0,-1 0 0,0 0 1,0 0-1,1 0 0,-1 0 0,0-1 0,1 1 0,-1 0 1,1-1-1,0 1 0,-3-4 0,-1-5-6750</inkml:trace>
 </inkml:ink>
 </file>

</xml_diff>